<commit_message>
docs: require the Word export to be regenerated with the SRS source
Adds OPS-05: any change to docs/SRS.md must be followed by
`npm run docs:srs-docx` in the same commit. Without it the committed Word
copy silently falls behind the Markdown, and the version clients hold stops
matching the specification of record.

Regenerated the .docx accordingly. Re-verified all SRS counts against the
code — 37 API routes, 21 pages, 20 migrations, 18 tables, 25 unit tests —
and confirmed the Word file still carries no internal gap content.

Co-Authored-By: Claude Opus 5 <noreply@anthropic.com>
Claude-Session: https://claude.ai/code/session_01Fe1CGZxpyfeAcgVSVvxjoH
</commit_message>
<xml_diff>
--- a/docs/Galaxy_CMMC_Portal_SRS_v1.0.docx
+++ b/docs/Galaxy_CMMC_Portal_SRS_v1.0.docx
@@ -15860,6 +15860,42 @@
       </w:r>
       <w:r>
         <w:t xml:space="preserve"> verification that no test records remain.</w:t>
+      </w:r>
+    </w:p>
+    <w:p>
+      <w:pPr>
+        <w:spacing w:after="140" w:line="276"/>
+      </w:pPr>
+      <w:r>
+        <w:rPr>
+          <w:b/>
+          <w:bCs/>
+        </w:rPr>
+        <w:t xml:space="preserve">OPS-05</w:t>
+      </w:r>
+      <w:r>
+        <w:t xml:space="preserve"> — This specification is maintained as Markdown and rendered to Word for distribution. Any change to the Markdown </w:t>
+      </w:r>
+      <w:r>
+        <w:rPr>
+          <w:b/>
+          <w:bCs/>
+        </w:rPr>
+        <w:t xml:space="preserve">shall</w:t>
+      </w:r>
+      <w:r>
+        <w:t xml:space="preserve"> be followed by </w:t>
+      </w:r>
+      <w:r>
+        <w:rPr>
+          <w:rFonts w:ascii="Consolas" w:cs="Consolas" w:eastAsia="Consolas" w:hAnsi="Consolas"/>
+          <w:sz w:val="20"/>
+          <w:szCs w:val="20"/>
+        </w:rPr>
+        <w:t xml:space="preserve">npm run docs:srs-docx</w:t>
+      </w:r>
+      <w:r>
+        <w:t xml:space="preserve"> in the same commit, so the distributed document cannot fall behind the source.</w:t>
       </w:r>
     </w:p>
     <w:p>

</xml_diff>